<commit_message>
Add Home link to navbar and remove em dashes from site and resume
</commit_message>
<xml_diff>
--- a/resume/ayesha-mughal-resume.docx
+++ b/resume/ayesha-mughal-resume.docx
@@ -79,25 +79,7 @@
         <w:rPr>
           <w:rFonts w:ascii="Calibri" w:eastAsia="Calibri" w:hAnsi="Calibri" w:cs="Calibri"/>
         </w:rPr>
-        <w:t>AI Engineer specializing in agentic systems and full-stack AI applications</w:t>
-      </w:r>
-      <w:r>
-        <w:rPr>
-          <w:rFonts w:ascii="Calibri" w:eastAsia="Calibri" w:hAnsi="Calibri" w:cs="Calibri"/>
-        </w:rPr>
-        <w:t>, building on Claude API and Google ADK. Technical writer with 1.4M+ cumulative views on Medium</w:t>
-      </w:r>
-      <w:r>
-        <w:rPr>
-          <w:rFonts w:ascii="Calibri" w:eastAsia="Calibri" w:hAnsi="Calibri" w:cs="Calibri"/>
-        </w:rPr>
-        <w:t xml:space="preserve"> and 1,100+ followers. Ranked Top 5 of 317 in the Ramadan Prompting Nights Competition 2026. GIAIC Excellence Team, Rising Star in AI. Starting BSCS at Mohammad Ali Jinnah University in Fall 2026</w:t>
-      </w:r>
-      <w:r>
-        <w:rPr>
-          <w:rFonts w:ascii="Calibri" w:eastAsia="Calibri" w:hAnsi="Calibri" w:cs="Calibri"/>
-        </w:rPr>
-        <w:t>.</w:t>
+        <w:t>AI Engineer specializing in agentic systems and full-stack AI applications, building on Claude API and Google ADK. Technical writer with 1.4M+ cumulative views on Medium and 1,100+ followers. Ranked Top 5 of 317 in the Ramadan Prompting Nights Competition 2026. GIAIC Excellence Team, Rising Star in AI. Starting BSCS at Mohammad Ali Jinnah University in Fall 2026.</w:t>
       </w:r>
     </w:p>
     <w:p>
@@ -148,13 +130,7 @@
         <w:rPr>
           <w:rFonts w:ascii="Calibri" w:eastAsia="Calibri" w:hAnsi="Calibri" w:cs="Calibri"/>
         </w:rPr>
-        <w:t>Frameworks: Next.js, Re</w:t>
-      </w:r>
-      <w:r>
-        <w:rPr>
-          <w:rFonts w:ascii="Calibri" w:eastAsia="Calibri" w:hAnsi="Calibri" w:cs="Calibri"/>
-        </w:rPr>
-        <w:t>act, FastAPI, Tailwind CSS, Node.js</w:t>
+        <w:t>Frameworks: Next.js, React, FastAPI, Tailwind CSS, Node.js</w:t>
       </w:r>
     </w:p>
     <w:p>
@@ -230,37 +206,23 @@
           <w:i/>
           <w:iCs/>
         </w:rPr>
-        <w:t>Self-Employed (Remote</w:t>
-      </w:r>
-      <w:r>
-        <w:rPr>
-          <w:rFonts w:ascii="Calibri" w:eastAsia="Calibri" w:hAnsi="Calibri" w:cs="Calibri"/>
-          <w:i/>
-          <w:iCs/>
-        </w:rPr>
-        <w:t>)</w:t>
-      </w:r>
-    </w:p>
-    <w:p>
-      <w:pPr>
-        <w:pStyle w:val="ListParagraph"/>
-        <w:numPr>
-          <w:ilvl w:val="0"/>
-          <w:numId w:val="1"/>
-        </w:numPr>
-        <w:spacing w:after="40"/>
-      </w:pPr>
-      <w:r>
-        <w:rPr>
-          <w:rFonts w:ascii="Calibri" w:eastAsia="Calibri" w:hAnsi="Calibri" w:cs="Calibri"/>
-        </w:rPr>
-        <w:t>Delivered AI agent and automation projects for international clients, including a 12-day AI-powered resume platform and</w:t>
-      </w:r>
-      <w:r>
-        <w:rPr>
-          <w:rFonts w:ascii="Calibri" w:eastAsia="Calibri" w:hAnsi="Calibri" w:cs="Calibri"/>
-        </w:rPr>
-        <w:t xml:space="preserve"> an n8n + Claude API email automation system.</w:t>
+        <w:t>Self-Employed (Remote)</w:t>
+      </w:r>
+    </w:p>
+    <w:p>
+      <w:pPr>
+        <w:pStyle w:val="ListParagraph"/>
+        <w:numPr>
+          <w:ilvl w:val="0"/>
+          <w:numId w:val="1"/>
+        </w:numPr>
+        <w:spacing w:after="40"/>
+      </w:pPr>
+      <w:r>
+        <w:rPr>
+          <w:rFonts w:ascii="Calibri" w:eastAsia="Calibri" w:hAnsi="Calibri" w:cs="Calibri"/>
+        </w:rPr>
+        <w:t>Delivered AI agent and automation projects for international clients, including a 12-day AI-powered resume platform and an n8n + Claude API email automation system.</w:t>
       </w:r>
     </w:p>
     <w:p>
@@ -292,35 +254,23 @@
         <w:rPr>
           <w:rFonts w:ascii="Calibri" w:eastAsia="Calibri" w:hAnsi="Calibri" w:cs="Calibri"/>
         </w:rPr>
-        <w:t>Delivered two commissioned technical articles for</w:t>
-      </w:r>
-      <w:r>
-        <w:rPr>
-          <w:rFonts w:ascii="Calibri" w:eastAsia="Calibri" w:hAnsi="Calibri" w:cs="Calibri"/>
-        </w:rPr>
-        <w:t xml:space="preserve"> a European design-industry client, each 2,000+ words, published on Artificial Intelligence in Plain English.</w:t>
-      </w:r>
-    </w:p>
-    <w:p>
-      <w:pPr>
-        <w:pStyle w:val="ListParagraph"/>
-        <w:numPr>
-          <w:ilvl w:val="0"/>
-          <w:numId w:val="1"/>
-        </w:numPr>
-        <w:spacing w:after="40"/>
-      </w:pPr>
-      <w:r>
-        <w:rPr>
-          <w:rFonts w:ascii="Calibri" w:eastAsia="Calibri" w:hAnsi="Calibri" w:cs="Calibri"/>
-        </w:rPr>
-        <w:t>Manage end-to-end client workflow across 4+ clients: $1.2K+ in client revenue across software and writing, 100% on-time delivery</w:t>
-      </w:r>
-      <w:r>
-        <w:rPr>
-          <w:rFonts w:ascii="Calibri" w:eastAsia="Calibri" w:hAnsi="Calibri" w:cs="Calibri"/>
-        </w:rPr>
-        <w:t>.</w:t>
+        <w:t>Delivered two commissioned technical articles for a European design-industry client, each 2,000+ words, published on Artificial Intelligence in Plain English.</w:t>
+      </w:r>
+    </w:p>
+    <w:p>
+      <w:pPr>
+        <w:pStyle w:val="ListParagraph"/>
+        <w:numPr>
+          <w:ilvl w:val="0"/>
+          <w:numId w:val="1"/>
+        </w:numPr>
+        <w:spacing w:after="40"/>
+      </w:pPr>
+      <w:r>
+        <w:rPr>
+          <w:rFonts w:ascii="Calibri" w:eastAsia="Calibri" w:hAnsi="Calibri" w:cs="Calibri"/>
+        </w:rPr>
+        <w:t>Manage end-to-end client workflow across 4+ clients: $1.2K+ in client revenue across software and writing, 100% on-time delivery.</w:t>
       </w:r>
     </w:p>
     <w:p>
@@ -336,7 +286,23 @@
           <w:b/>
           <w:bCs/>
         </w:rPr>
-        <w:t>Technical Writer — In Plain English (Medium)</w:t>
+        <w:t>Technical Writer</w:t>
+      </w:r>
+      <w:r>
+        <w:rPr>
+          <w:rFonts w:ascii="Calibri" w:eastAsia="Calibri" w:hAnsi="Calibri" w:cs="Calibri"/>
+          <w:b/>
+          <w:bCs/>
+        </w:rPr>
+        <w:t xml:space="preserve"> | </w:t>
+      </w:r>
+      <w:r>
+        <w:rPr>
+          <w:rFonts w:ascii="Calibri" w:eastAsia="Calibri" w:hAnsi="Calibri" w:cs="Calibri"/>
+          <w:b/>
+          <w:bCs/>
+        </w:rPr>
+        <w:t>In Plain English (Medium)</w:t>
       </w:r>
       <w:r>
         <w:rPr>
@@ -367,35 +333,23 @@
         <w:rPr>
           <w:rFonts w:ascii="Calibri" w:eastAsia="Calibri" w:hAnsi="Calibri" w:cs="Calibri"/>
         </w:rPr>
-        <w:t>Grew readership to 23,000 reads</w:t>
-      </w:r>
-      <w:r>
-        <w:rPr>
-          <w:rFonts w:ascii="Calibri" w:eastAsia="Calibri" w:hAnsi="Calibri" w:cs="Calibri"/>
-        </w:rPr>
-        <w:t xml:space="preserve"> in a 21-day span; surpassed 1,000 followers.</w:t>
-      </w:r>
-    </w:p>
-    <w:p>
-      <w:pPr>
-        <w:pStyle w:val="ListParagraph"/>
-        <w:numPr>
-          <w:ilvl w:val="0"/>
-          <w:numId w:val="1"/>
-        </w:numPr>
-        <w:spacing w:after="40"/>
-      </w:pPr>
-      <w:r>
-        <w:rPr>
-          <w:rFonts w:ascii="Calibri" w:eastAsia="Calibri" w:hAnsi="Calibri" w:cs="Calibri"/>
-        </w:rPr>
-        <w:t>Author of the Agentic Engineering series (7 articles), covering OpenA</w:t>
-      </w:r>
-      <w:r>
-        <w:rPr>
-          <w:rFonts w:ascii="Calibri" w:eastAsia="Calibri" w:hAnsi="Calibri" w:cs="Calibri"/>
-        </w:rPr>
-        <w:t>I Agents SDK, MCP, LangChain, and RAG; contributed to 1.4M+ cumulative Medium views in April 2026.</w:t>
+        <w:t>Grew readership to 23,000 reads in a 21-day span; surpassed 1,000 followers.</w:t>
+      </w:r>
+    </w:p>
+    <w:p>
+      <w:pPr>
+        <w:pStyle w:val="ListParagraph"/>
+        <w:numPr>
+          <w:ilvl w:val="0"/>
+          <w:numId w:val="1"/>
+        </w:numPr>
+        <w:spacing w:after="40"/>
+      </w:pPr>
+      <w:r>
+        <w:rPr>
+          <w:rFonts w:ascii="Calibri" w:eastAsia="Calibri" w:hAnsi="Calibri" w:cs="Calibri"/>
+        </w:rPr>
+        <w:t>Author of the Agentic Engineering series (7 articles), covering OpenAI Agents SDK, MCP, LangChain, and RAG; contributed to 1.4M+ cumulative Medium views in April 2026.</w:t>
       </w:r>
     </w:p>
     <w:p>
@@ -434,13 +388,7 @@
           <w:rFonts w:ascii="Calibri" w:eastAsia="Calibri" w:hAnsi="Calibri" w:cs="Calibri"/>
         </w:rPr>
         <w:tab/>
-        <w:t>Sep 2024 – Dec</w:t>
-      </w:r>
-      <w:r>
-        <w:rPr>
-          <w:rFonts w:ascii="Calibri" w:eastAsia="Calibri" w:hAnsi="Calibri" w:cs="Calibri"/>
-        </w:rPr>
-        <w:t xml:space="preserve"> 2024</w:t>
+        <w:t>Sep 2024 – Dec 2024</w:t>
       </w:r>
     </w:p>
     <w:p>
@@ -453,7 +401,23 @@
           <w:i/>
           <w:iCs/>
         </w:rPr>
-        <w:t>GAO Tek — Bangladesh (Remote)</w:t>
+        <w:t>GAO Tek</w:t>
+      </w:r>
+      <w:r>
+        <w:rPr>
+          <w:rFonts w:ascii="Calibri" w:eastAsia="Calibri" w:hAnsi="Calibri" w:cs="Calibri"/>
+          <w:i/>
+          <w:iCs/>
+        </w:rPr>
+        <w:t xml:space="preserve"> | </w:t>
+      </w:r>
+      <w:r>
+        <w:rPr>
+          <w:rFonts w:ascii="Calibri" w:eastAsia="Calibri" w:hAnsi="Calibri" w:cs="Calibri"/>
+          <w:i/>
+          <w:iCs/>
+        </w:rPr>
+        <w:t>Bangladesh (Remote)</w:t>
       </w:r>
     </w:p>
     <w:p>
@@ -589,7 +553,23 @@
           <w:b/>
           <w:bCs/>
         </w:rPr>
-        <w:t>ServeEase — Restaurant Ordering &amp; Management Platform</w:t>
+        <w:t>ServeEase</w:t>
+      </w:r>
+      <w:r>
+        <w:rPr>
+          <w:rFonts w:ascii="Calibri" w:eastAsia="Calibri" w:hAnsi="Calibri" w:cs="Calibri"/>
+          <w:b/>
+          <w:bCs/>
+        </w:rPr>
+        <w:t xml:space="preserve"> | </w:t>
+      </w:r>
+      <w:r>
+        <w:rPr>
+          <w:rFonts w:ascii="Calibri" w:eastAsia="Calibri" w:hAnsi="Calibri" w:cs="Calibri"/>
+          <w:b/>
+          <w:bCs/>
+        </w:rPr>
+        <w:t>Restaurant Ordering &amp; Management Platform</w:t>
       </w:r>
       <w:r>
         <w:rPr>
@@ -613,13 +593,7 @@
           <w:rFonts w:ascii="Calibri" w:eastAsia="Calibri" w:hAnsi="Calibri" w:cs="Calibri"/>
         </w:rPr>
         <w:lastRenderedPageBreak/>
-        <w:t>Contactless dine-in ordering system: each table has a dedicated QR code, orders route directly to a real-time kitchen display screen, eliminating the need for waitstaff to take</w:t>
-      </w:r>
-      <w:r>
-        <w:rPr>
-          <w:rFonts w:ascii="Calibri" w:eastAsia="Calibri" w:hAnsi="Calibri" w:cs="Calibri"/>
-        </w:rPr>
-        <w:t xml:space="preserve"> or relay orders.</w:t>
+        <w:t>Contactless dine-in ordering system: each table has a dedicated QR code, orders route directly to a real-time kitchen display screen, eliminating the need for waitstaff to take or relay orders.</w:t>
       </w:r>
     </w:p>
     <w:p>
@@ -651,13 +625,7 @@
         <w:rPr>
           <w:rFonts w:ascii="Calibri" w:eastAsia="Calibri" w:hAnsi="Calibri" w:cs="Calibri"/>
         </w:rPr>
-        <w:t>Implemented role-based access for three user types: kitchen staff, table service, and owner/admin, with menu management cont</w:t>
-      </w:r>
-      <w:r>
-        <w:rPr>
-          <w:rFonts w:ascii="Calibri" w:eastAsia="Calibri" w:hAnsi="Calibri" w:cs="Calibri"/>
-        </w:rPr>
-        <w:t>rols reserved for the admin role.</w:t>
+        <w:t>Implemented role-based access for three user types: kitchen staff, table service, and owner/admin, with menu management controls reserved for the admin role.</w:t>
       </w:r>
     </w:p>
     <w:p>
@@ -689,7 +657,23 @@
           <w:b/>
           <w:bCs/>
         </w:rPr>
-        <w:t>Tareekh-ky-Jhonky — Pakistani Heritage Scanner</w:t>
+        <w:t>Tareekh-ky-Jhonky</w:t>
+      </w:r>
+      <w:r>
+        <w:rPr>
+          <w:rFonts w:ascii="Calibri" w:eastAsia="Calibri" w:hAnsi="Calibri" w:cs="Calibri"/>
+          <w:b/>
+          <w:bCs/>
+        </w:rPr>
+        <w:t xml:space="preserve"> | </w:t>
+      </w:r>
+      <w:r>
+        <w:rPr>
+          <w:rFonts w:ascii="Calibri" w:eastAsia="Calibri" w:hAnsi="Calibri" w:cs="Calibri"/>
+          <w:b/>
+          <w:bCs/>
+        </w:rPr>
+        <w:t>Pakistani Heritage Scanner</w:t>
       </w:r>
       <w:r>
         <w:rPr>
@@ -724,13 +708,7 @@
         <w:rPr>
           <w:rFonts w:ascii="Calibri" w:eastAsia="Calibri" w:hAnsi="Calibri" w:cs="Calibri"/>
         </w:rPr>
-        <w:t xml:space="preserve">Built a RAG-based artifact recognition app with audio walks and </w:t>
-      </w:r>
-      <w:r>
-        <w:rPr>
-          <w:rFonts w:ascii="Calibri" w:eastAsia="Calibri" w:hAnsi="Calibri" w:cs="Calibri"/>
-        </w:rPr>
-        <w:t>inscription translation, using Gemini 1.5 Pro, Google ADK, and FastAPI, deployed on Google Cloud Run.</w:t>
+        <w:t>Built a RAG-based artifact recognition app with audio walks and inscription translation, using Gemini 1.5 Pro, Google ADK, and FastAPI, deployed on Google Cloud Run.</w:t>
       </w:r>
     </w:p>
     <w:p>
@@ -746,7 +724,23 @@
           <w:b/>
           <w:bCs/>
         </w:rPr>
-        <w:t>SpeakUp Coach — AI Interview Coaching Platform</w:t>
+        <w:t>SpeakUp Coach</w:t>
+      </w:r>
+      <w:r>
+        <w:rPr>
+          <w:rFonts w:ascii="Calibri" w:eastAsia="Calibri" w:hAnsi="Calibri" w:cs="Calibri"/>
+          <w:b/>
+          <w:bCs/>
+        </w:rPr>
+        <w:t xml:space="preserve"> | </w:t>
+      </w:r>
+      <w:r>
+        <w:rPr>
+          <w:rFonts w:ascii="Calibri" w:eastAsia="Calibri" w:hAnsi="Calibri" w:cs="Calibri"/>
+          <w:b/>
+          <w:bCs/>
+        </w:rPr>
+        <w:t>AI Interview Coaching Platform</w:t>
       </w:r>
       <w:r>
         <w:rPr>
@@ -781,13 +775,7 @@
         <w:rPr>
           <w:rFonts w:ascii="Calibri" w:eastAsia="Calibri" w:hAnsi="Calibri" w:cs="Calibri"/>
         </w:rPr>
-        <w:t>Built an interview coaching platform for first-gener</w:t>
-      </w:r>
-      <w:r>
-        <w:rPr>
-          <w:rFonts w:ascii="Calibri" w:eastAsia="Calibri" w:hAnsi="Calibri" w:cs="Calibri"/>
-        </w:rPr>
-        <w:t>ation students with Urdu feedback delivery, using React, Supabase Auth, Whisper, FastAPI, PostgreSQL, and Claude/GPT API.</w:t>
+        <w:t>Built an interview coaching platform for first-generation students with Urdu feedback delivery, using React, Supabase Auth, Whisper, FastAPI, PostgreSQL, and Claude/GPT API.</w:t>
       </w:r>
     </w:p>
     <w:p>
@@ -857,15 +845,23 @@
           <w:b/>
           <w:bCs/>
         </w:rPr>
-        <w:t xml:space="preserve">GIAIC — Governor's Initiative for AI &amp; </w:t>
-      </w:r>
-      <w:r>
-        <w:rPr>
-          <w:rFonts w:ascii="Calibri" w:eastAsia="Calibri" w:hAnsi="Calibri" w:cs="Calibri"/>
-          <w:b/>
-          <w:bCs/>
-        </w:rPr>
-        <w:t>Computing</w:t>
+        <w:t>GIAIC</w:t>
+      </w:r>
+      <w:r>
+        <w:rPr>
+          <w:rFonts w:ascii="Calibri" w:eastAsia="Calibri" w:hAnsi="Calibri" w:cs="Calibri"/>
+          <w:b/>
+          <w:bCs/>
+        </w:rPr>
+        <w:t xml:space="preserve"> | </w:t>
+      </w:r>
+      <w:r>
+        <w:rPr>
+          <w:rFonts w:ascii="Calibri" w:eastAsia="Calibri" w:hAnsi="Calibri" w:cs="Calibri"/>
+          <w:b/>
+          <w:bCs/>
+        </w:rPr>
+        <w:t>Governor's Initiative for AI &amp; Computing</w:t>
       </w:r>
       <w:r>
         <w:rPr>
@@ -885,7 +881,23 @@
           <w:i/>
           <w:iCs/>
         </w:rPr>
-        <w:t>Q4, Excellence Team, Rising Star — final graduation paper in progress</w:t>
+        <w:t xml:space="preserve">Q4, Excellence Team, </w:t>
+      </w:r>
+      <w:r>
+        <w:rPr>
+          <w:rFonts w:ascii="Calibri" w:eastAsia="Calibri" w:hAnsi="Calibri" w:cs="Calibri"/>
+          <w:i/>
+          <w:iCs/>
+        </w:rPr>
+        <w:t>Rising Star, final graduation paper</w:t>
+      </w:r>
+      <w:r>
+        <w:rPr>
+          <w:rFonts w:ascii="Calibri" w:eastAsia="Calibri" w:hAnsi="Calibri" w:cs="Calibri"/>
+          <w:i/>
+          <w:iCs/>
+        </w:rPr>
+        <w:t xml:space="preserve"> in progress</w:t>
       </w:r>
     </w:p>
     <w:p>
@@ -920,7 +932,23 @@
           <w:i/>
           <w:iCs/>
         </w:rPr>
-        <w:t>Government Girls Degree College, Zamzama Clifton — Grade A</w:t>
+        <w:t>Government Girls Degree College, Zamzama Clifton</w:t>
+      </w:r>
+      <w:r>
+        <w:rPr>
+          <w:rFonts w:ascii="Calibri" w:eastAsia="Calibri" w:hAnsi="Calibri" w:cs="Calibri"/>
+          <w:i/>
+          <w:iCs/>
+        </w:rPr>
+        <w:t xml:space="preserve"> | </w:t>
+      </w:r>
+      <w:r>
+        <w:rPr>
+          <w:rFonts w:ascii="Calibri" w:eastAsia="Calibri" w:hAnsi="Calibri" w:cs="Calibri"/>
+          <w:i/>
+          <w:iCs/>
+        </w:rPr>
+        <w:t>Grade A</w:t>
       </w:r>
     </w:p>
     <w:p>
@@ -955,7 +983,23 @@
           <w:i/>
           <w:iCs/>
         </w:rPr>
-        <w:t>The Justuju School — Science, Grade A</w:t>
+        <w:t>The Justuju School</w:t>
+      </w:r>
+      <w:r>
+        <w:rPr>
+          <w:rFonts w:ascii="Calibri" w:eastAsia="Calibri" w:hAnsi="Calibri" w:cs="Calibri"/>
+          <w:i/>
+          <w:iCs/>
+        </w:rPr>
+        <w:t xml:space="preserve"> | </w:t>
+      </w:r>
+      <w:r>
+        <w:rPr>
+          <w:rFonts w:ascii="Calibri" w:eastAsia="Calibri" w:hAnsi="Calibri" w:cs="Calibri"/>
+          <w:i/>
+          <w:iCs/>
+        </w:rPr>
+        <w:t>Science, Grade A</w:t>
       </w:r>
     </w:p>
     <w:p>
@@ -989,77 +1033,131 @@
         <w:rPr>
           <w:rFonts w:ascii="Calibri" w:eastAsia="Calibri" w:hAnsi="Calibri" w:cs="Calibri"/>
         </w:rPr>
-        <w:t>CS50: Introduction to Artificial Intelligence with Python — Harvard University</w:t>
-      </w:r>
-    </w:p>
-    <w:p>
-      <w:pPr>
-        <w:pStyle w:val="ListParagraph"/>
-        <w:numPr>
-          <w:ilvl w:val="0"/>
-          <w:numId w:val="1"/>
-        </w:numPr>
-        <w:spacing w:after="40"/>
-      </w:pPr>
-      <w:r>
-        <w:rPr>
-          <w:rFonts w:ascii="Calibri" w:eastAsia="Calibri" w:hAnsi="Calibri" w:cs="Calibri"/>
-        </w:rPr>
-        <w:t>Code in Place 2026 — Stanford University</w:t>
-      </w:r>
-    </w:p>
-    <w:p>
-      <w:pPr>
-        <w:pStyle w:val="ListParagraph"/>
-        <w:numPr>
-          <w:ilvl w:val="0"/>
-          <w:numId w:val="1"/>
-        </w:numPr>
-        <w:spacing w:after="40"/>
-      </w:pPr>
-      <w:r>
-        <w:rPr>
-          <w:rFonts w:ascii="Calibri" w:eastAsia="Calibri" w:hAnsi="Calibri" w:cs="Calibri"/>
-        </w:rPr>
-        <w:t>Google Cloud Skills Boost, Silver League (1,060 points) — includes Engineer AI Agen</w:t>
-      </w:r>
-      <w:r>
-        <w:rPr>
-          <w:rFonts w:ascii="Calibri" w:eastAsia="Calibri" w:hAnsi="Calibri" w:cs="Calibri"/>
-        </w:rPr>
-        <w:t>ts with ADK badge</w:t>
-      </w:r>
-    </w:p>
-    <w:p>
-      <w:pPr>
-        <w:pStyle w:val="ListParagraph"/>
-        <w:numPr>
-          <w:ilvl w:val="0"/>
-          <w:numId w:val="1"/>
-        </w:numPr>
-        <w:spacing w:after="40"/>
-      </w:pPr>
-      <w:r>
-        <w:rPr>
-          <w:rFonts w:ascii="Calibri" w:eastAsia="Calibri" w:hAnsi="Calibri" w:cs="Calibri"/>
-        </w:rPr>
-        <w:t>CS50 Puzzle Day — 9/9 Individual</w:t>
-      </w:r>
-    </w:p>
-    <w:p>
-      <w:pPr>
-        <w:pStyle w:val="ListParagraph"/>
-        <w:numPr>
-          <w:ilvl w:val="0"/>
-          <w:numId w:val="1"/>
-        </w:numPr>
-        <w:spacing w:after="40"/>
-      </w:pPr>
-      <w:r>
-        <w:rPr>
-          <w:rFonts w:ascii="Calibri" w:eastAsia="Calibri" w:hAnsi="Calibri" w:cs="Calibri"/>
-        </w:rPr>
-        <w:t>Responsive Web Designer — freeCodeCamp</w:t>
+        <w:t>CS50: Introduction to Artificial Intelligence with Python</w:t>
+      </w:r>
+      <w:r>
+        <w:rPr>
+          <w:rFonts w:ascii="Calibri" w:eastAsia="Calibri" w:hAnsi="Calibri" w:cs="Calibri"/>
+        </w:rPr>
+        <w:t xml:space="preserve"> | </w:t>
+      </w:r>
+      <w:r>
+        <w:rPr>
+          <w:rFonts w:ascii="Calibri" w:eastAsia="Calibri" w:hAnsi="Calibri" w:cs="Calibri"/>
+        </w:rPr>
+        <w:t>Harvard University</w:t>
+      </w:r>
+    </w:p>
+    <w:p>
+      <w:pPr>
+        <w:pStyle w:val="ListParagraph"/>
+        <w:numPr>
+          <w:ilvl w:val="0"/>
+          <w:numId w:val="1"/>
+        </w:numPr>
+        <w:spacing w:after="40"/>
+      </w:pPr>
+      <w:r>
+        <w:rPr>
+          <w:rFonts w:ascii="Calibri" w:eastAsia="Calibri" w:hAnsi="Calibri" w:cs="Calibri"/>
+        </w:rPr>
+        <w:t>Code in Place 2026</w:t>
+      </w:r>
+      <w:r>
+        <w:rPr>
+          <w:rFonts w:ascii="Calibri" w:eastAsia="Calibri" w:hAnsi="Calibri" w:cs="Calibri"/>
+        </w:rPr>
+        <w:t xml:space="preserve"> | </w:t>
+      </w:r>
+      <w:r>
+        <w:rPr>
+          <w:rFonts w:ascii="Calibri" w:eastAsia="Calibri" w:hAnsi="Calibri" w:cs="Calibri"/>
+        </w:rPr>
+        <w:t>Stanford University</w:t>
+      </w:r>
+    </w:p>
+    <w:p>
+      <w:pPr>
+        <w:pStyle w:val="ListParagraph"/>
+        <w:numPr>
+          <w:ilvl w:val="0"/>
+          <w:numId w:val="1"/>
+        </w:numPr>
+        <w:spacing w:after="40"/>
+      </w:pPr>
+      <w:r>
+        <w:rPr>
+          <w:rFonts w:ascii="Calibri" w:eastAsia="Calibri" w:hAnsi="Calibri" w:cs="Calibri"/>
+        </w:rPr>
+        <w:t xml:space="preserve">Google Cloud Skills Boost, Silver League </w:t>
+      </w:r>
+      <w:r>
+        <w:rPr>
+          <w:rFonts w:ascii="Calibri" w:eastAsia="Calibri" w:hAnsi="Calibri" w:cs="Calibri"/>
+        </w:rPr>
+        <w:t>(1,060 points), including</w:t>
+      </w:r>
+      <w:r>
+        <w:rPr>
+          <w:rFonts w:ascii="Calibri" w:eastAsia="Calibri" w:hAnsi="Calibri" w:cs="Calibri"/>
+        </w:rPr>
+        <w:t xml:space="preserve"> Engineer AI Agents with ADK badge</w:t>
+      </w:r>
+    </w:p>
+    <w:p>
+      <w:pPr>
+        <w:pStyle w:val="ListParagraph"/>
+        <w:numPr>
+          <w:ilvl w:val="0"/>
+          <w:numId w:val="1"/>
+        </w:numPr>
+        <w:spacing w:after="40"/>
+      </w:pPr>
+      <w:r>
+        <w:rPr>
+          <w:rFonts w:ascii="Calibri" w:eastAsia="Calibri" w:hAnsi="Calibri" w:cs="Calibri"/>
+        </w:rPr>
+        <w:t>CS50 Puzzle Day</w:t>
+      </w:r>
+      <w:r>
+        <w:rPr>
+          <w:rFonts w:ascii="Calibri" w:eastAsia="Calibri" w:hAnsi="Calibri" w:cs="Calibri"/>
+        </w:rPr>
+        <w:t xml:space="preserve"> | </w:t>
+      </w:r>
+      <w:r>
+        <w:rPr>
+          <w:rFonts w:ascii="Calibri" w:eastAsia="Calibri" w:hAnsi="Calibri" w:cs="Calibri"/>
+        </w:rPr>
+        <w:t>9/9 Individual</w:t>
+      </w:r>
+    </w:p>
+    <w:p>
+      <w:pPr>
+        <w:pStyle w:val="ListParagraph"/>
+        <w:numPr>
+          <w:ilvl w:val="0"/>
+          <w:numId w:val="1"/>
+        </w:numPr>
+        <w:spacing w:after="40"/>
+      </w:pPr>
+      <w:r>
+        <w:rPr>
+          <w:rFonts w:ascii="Calibri" w:eastAsia="Calibri" w:hAnsi="Calibri" w:cs="Calibri"/>
+        </w:rPr>
+        <w:t>Responsive Web Designer</w:t>
+      </w:r>
+      <w:r>
+        <w:rPr>
+          <w:rFonts w:ascii="Calibri" w:eastAsia="Calibri" w:hAnsi="Calibri" w:cs="Calibri"/>
+        </w:rPr>
+        <w:t xml:space="preserve"> | </w:t>
+      </w:r>
+      <w:r>
+        <w:rPr>
+          <w:rFonts w:ascii="Calibri" w:eastAsia="Calibri" w:hAnsi="Calibri" w:cs="Calibri"/>
+        </w:rPr>
+        <w:t>freeCodeCamp</w:t>
       </w:r>
     </w:p>
     <w:p>

</xml_diff>

<commit_message>
Replace long dashes in certificate titles, dates, and resume
</commit_message>
<xml_diff>
--- a/resume/ayesha-mughal-resume.docx
+++ b/resume/ayesha-mughal-resume.docx
@@ -193,7 +193,19 @@
           <w:rFonts w:ascii="Calibri" w:eastAsia="Calibri" w:hAnsi="Calibri" w:cs="Calibri"/>
         </w:rPr>
         <w:tab/>
-        <w:t>Jan 2025 – Present</w:t>
+        <w:t xml:space="preserve">Jan 2025 </w:t>
+      </w:r>
+      <w:r>
+        <w:rPr>
+          <w:rFonts w:ascii="Calibri" w:eastAsia="Calibri" w:hAnsi="Calibri" w:cs="Calibri"/>
+        </w:rPr>
+        <w:t>-</w:t>
+      </w:r>
+      <w:r>
+        <w:rPr>
+          <w:rFonts w:ascii="Calibri" w:eastAsia="Calibri" w:hAnsi="Calibri" w:cs="Calibri"/>
+        </w:rPr>
+        <w:t xml:space="preserve"> Present</w:t>
       </w:r>
     </w:p>
     <w:p>
@@ -317,7 +329,19 @@
         <w:rPr>
           <w:rFonts w:ascii="Calibri" w:eastAsia="Calibri" w:hAnsi="Calibri" w:cs="Calibri"/>
         </w:rPr>
-        <w:t xml:space="preserve"> – Present</w:t>
+        <w:t xml:space="preserve"> </w:t>
+      </w:r>
+      <w:r>
+        <w:rPr>
+          <w:rFonts w:ascii="Calibri" w:eastAsia="Calibri" w:hAnsi="Calibri" w:cs="Calibri"/>
+        </w:rPr>
+        <w:t>-</w:t>
+      </w:r>
+      <w:r>
+        <w:rPr>
+          <w:rFonts w:ascii="Calibri" w:eastAsia="Calibri" w:hAnsi="Calibri" w:cs="Calibri"/>
+        </w:rPr>
+        <w:t xml:space="preserve"> Present</w:t>
       </w:r>
     </w:p>
     <w:p>
@@ -388,7 +412,19 @@
           <w:rFonts w:ascii="Calibri" w:eastAsia="Calibri" w:hAnsi="Calibri" w:cs="Calibri"/>
         </w:rPr>
         <w:tab/>
-        <w:t>Sep 2024 – Dec 2024</w:t>
+        <w:t xml:space="preserve">Sep 2024 </w:t>
+      </w:r>
+      <w:r>
+        <w:rPr>
+          <w:rFonts w:ascii="Calibri" w:eastAsia="Calibri" w:hAnsi="Calibri" w:cs="Calibri"/>
+        </w:rPr>
+        <w:t>-</w:t>
+      </w:r>
+      <w:r>
+        <w:rPr>
+          <w:rFonts w:ascii="Calibri" w:eastAsia="Calibri" w:hAnsi="Calibri" w:cs="Calibri"/>
+        </w:rPr>
+        <w:t xml:space="preserve"> Dec 2024</w:t>
       </w:r>
     </w:p>
     <w:p>
@@ -868,7 +904,19 @@
           <w:rFonts w:ascii="Calibri" w:eastAsia="Calibri" w:hAnsi="Calibri" w:cs="Calibri"/>
         </w:rPr>
         <w:tab/>
-        <w:t>2024 – Present</w:t>
+        <w:t xml:space="preserve">2024 </w:t>
+      </w:r>
+      <w:r>
+        <w:rPr>
+          <w:rFonts w:ascii="Calibri" w:eastAsia="Calibri" w:hAnsi="Calibri" w:cs="Calibri"/>
+        </w:rPr>
+        <w:t>-</w:t>
+      </w:r>
+      <w:r>
+        <w:rPr>
+          <w:rFonts w:ascii="Calibri" w:eastAsia="Calibri" w:hAnsi="Calibri" w:cs="Calibri"/>
+        </w:rPr>
+        <w:t xml:space="preserve"> Present</w:t>
       </w:r>
     </w:p>
     <w:p>

</xml_diff>